<commit_message>
court(guam): answering brief and petition for rehearing regenerated on the model at master, still report (fb-595.54.78)
Co-Authored-By: Claude Opus 5.5 <noreply@anthropic.com>
</commit_message>
<xml_diff>
--- a/courts/ninth-circuit/guam/state/supreme-court/answering-brief/usage/OUTPUT-answering-brief.docx
+++ b/courts/ninth-circuit/guam/state/supreme-court/answering-brief/usage/OUTPUT-answering-brief.docx
@@ -2950,7 +2950,7 @@
         <w:t xml:space="preserve">In re Request of Gutierrez</w:t>
       </w:r>
       <w:r>
-        <w:t xml:space="preserve">”) (“[The Party] who alleges the unconstitutionality of an act bears the burden of proof . . . . [and] the validity of acts is to be upheld if at all possible with all doubt resolved in favor of legality and unconstitutionality will be decreed only when no other reasonable alternative presents itself . . . .”) (citations omitted).</w:t>
+        <w:t xml:space="preserve">”) (“[The Party] who alleges the unconstitutionality of an act bears the burden of proof . . . . [and] the validity of acts is to be upheld if at all possible with all doubt resolved in favor of legality and unconstitutionality will be decreed only when no other reasonable alternative presents itself . . . .”) (citations omitted).</w:t>
       </w:r>
     </w:p>
     <w:p>
@@ -3762,7 +3762,7 @@
         <w:pStyle w:val="XdQuoteOnly"/>
       </w:pPr>
       <w:r>
-        <w:t xml:space="preserve">the Legislature may, of course determine whether a hospital shall exist at all, where and how large it shall be, the size and qualifications for appointment to the governing body, and a wide variety of other matters establishing the laws of Guam ‘subject to’ which the Governor perform his function with respect to the hospital . . . .</w:t>
+        <w:t xml:space="preserve">the Legislature may, of course determine whether a hospital shall exist at all, where and how large it shall be, the size and qualifications for appointment to the governing body, and a wide variety of other matters establishing the laws of Guam ‘subject to’ which the Governor perform his function with respect to the hospital . . . .</w:t>
       </w:r>
     </w:p>
     <w:p>
@@ -4297,13 +4297,7 @@
         <w:pStyle w:val="BodyTextNote"/>
       </w:pPr>
       <w:r>
-        <w:t xml:space="preserve">The Legislature disputes the Governor’s assertion that the quarantine provisions of the EHPA are unlawful delegations of section 1421g(a) power to the courts. Petitioner’s Reply Brief at 10. The quarantine provisions of the EHPA, including the statutory forms of relief, are consistent with the Legislature’s authority to vest in local courts jurisdiction over all causes as the laws of Guam provide. See 48 U.S.C.A. § 1424</w:t>
-      </w:r>
-      <w:r>
-        <w:noBreakHyphen/>
-      </w:r>
-      <w:r>
-        <w:t xml:space="preserve">1(d); accord</w:t>
+        <w:t xml:space="preserve">The Legislature disputes the Governor’s assertion that the quarantine provisions of the EHPA are unlawful delegations of section 1421g(a) power to the courts. Petitioner’s Reply Brief at 10. The quarantine provisions of the EHPA, including the statutory forms of relief, are consistent with the Legislature’s authority to vest in local courts jurisdiction over all causes as the laws of Guam provide. See 48 U.S.C.A. § 1424-⁠1(d); accord</w:t>
       </w:r>
       <w:r>
         <w:t xml:space="preserve"> </w:t>
@@ -4319,30 +4313,24 @@
         <w:t xml:space="preserve"> </w:t>
       </w:r>
       <w:r>
-        <w:t xml:space="preserve">at ¶ 5 (in construing the prior version of 48 U.S.C. § 1424</w:t>
+        <w:t xml:space="preserve">at ¶ 5 (in construing the prior version of 48 U.S.C. § 1424-⁠1(b)</w:t>
+      </w:r>
+      <w:r>
+        <w:rPr>
+          <w:rStyle w:val="FootnoteReference"/>
+        </w:rPr>
+        <w:footnoteReference w:id="13"/>
+      </w:r>
+      <w:r>
+        <w:t xml:space="preserve"> </w:t>
+      </w:r>
+      <w:r>
+        <w:t xml:space="preserve">relative to local court jurisdiction and whether it could review 7 GCA § 4104 cases, the court found “this section of the Organic Act gives the Legislature broad authority to define the jurisdiction of local courts.”). The current version of section 1424</w:t>
       </w:r>
       <w:r>
         <w:noBreakHyphen/>
       </w:r>
       <w:r>
-        <w:t xml:space="preserve">1(b)</w:t>
-      </w:r>
-      <w:r>
-        <w:rPr>
-          <w:rStyle w:val="FootnoteReference"/>
-        </w:rPr>
-        <w:footnoteReference w:id="13"/>
-      </w:r>
-      <w:r>
-        <w:t xml:space="preserve"> </w:t>
-      </w:r>
-      <w:r>
-        <w:t xml:space="preserve">relative to local court jurisdiction and whether it could review 7 GCA § 4104 cases, the court found “this section of the Organic Act gives the Legislature broad authority to define the jurisdiction of local courts.”). The current version of section 1424</w:t>
-      </w:r>
-      <w:r>
-        <w:noBreakHyphen/>
-      </w:r>
-      <w:r>
         <w:t xml:space="preserve">1(d) of the Organic Act of Guam provides in relevant part,</w:t>
       </w:r>
     </w:p>
@@ -4359,13 +4347,7 @@
         <w:pStyle w:val="BodyText"/>
       </w:pPr>
       <w:r>
-        <w:t xml:space="preserve">48 U.S.C.A. § 1424</w:t>
-      </w:r>
-      <w:r>
-        <w:noBreakHyphen/>
-      </w:r>
-      <w:r>
-        <w:t xml:space="preserve">1(d).</w:t>
+        <w:t xml:space="preserve">48 U.S.C.A. § 1424-⁠1(d).</w:t>
       </w:r>
     </w:p>
     <w:p>
@@ -4389,7 +4371,7 @@
         <w:t xml:space="preserve"> </w:t>
       </w:r>
       <w:r>
-        <w:t xml:space="preserve">at 709 (finding separate provision, section 1422c(a), to support Legislature’s concurrent section 1421g(b) authority over public education, otherwise “such broad interpretation . . . would entail reading the provision in a vacuum. The authority to establish merit system was clearly intended to be within the Legislature’s province.”).</w:t>
+        <w:t xml:space="preserve">at 709 (finding separate provision, section 1422c(a), to support Legislature’s concurrent section 1421g(b) authority over public education, otherwise “such broad interpretation . . . would entail reading the provision in a vacuum. The authority to establish merit system was clearly intended to be within the Legislature’s province.”).</w:t>
       </w:r>
     </w:p>
     <w:p>
@@ -5414,7 +5396,7 @@
         <w:tab/>
       </w:r>
       <w:r>
-        <w:t xml:space="preserve">“authorizing the court to fashion remedies that . . . allow the court itself to have a say in the promulgation of quarantine regulations.”</w:t>
+        <w:t xml:space="preserve">“authorizing the court to fashion remedies that . . . allow the court itself to have a say in the promulgation of quarantine regulations.”</w:t>
       </w:r>
     </w:p>
     <w:p>
@@ -5881,7 +5863,7 @@
         <w:pStyle w:val="BodyText"/>
       </w:pPr>
       <w:r>
-        <w:t xml:space="preserve">The Governor further argues that sections 19604 and 19605 allow a court’s order to supplant DPHSS quarantine policy, which results in the provisions being “in direct and irreconcilable conflict with the relevant Organic Act provisions with respect to quarantine authority. See Petitioner’s Reply Brief at 4. 10 GCA §§ 19604 and 19605 do not grant the Superior Court authority to “modify a quarantine order issued by DPHSS,” nor do said provisions grant the court the ability to, in effect, make quarantine policy. See Second Order and Scheduling Order (Mar. 9, 2021). The court, in determining relief under the EHPA, must consider the application or request brought by the “individual or groups of individuals . . . quarantined”—not determine and order relief that subsequently applies to all quarantined individuals irrespective of the evolving circumstances of a public health emergency. See 10 GCA § 19605(c)⁠(1) and (c)⁠(2).</w:t>
+        <w:t xml:space="preserve">The Governor further argues that sections 19604 and 19605 allow a court’s order to supplant DPHSS quarantine policy, which results in the provisions being “in direct and irreconcilable conflict with the relevant Organic Act provisions with respect to quarantine authority. See Petitioner’s Reply Brief at 4. 10 GCA §§ 19604 and 19605 do not grant the Superior Court authority to “modify a quarantine order issued by DPHSS,” nor do said provisions grant the court the ability to, in effect, make quarantine policy. See Second Order and Scheduling Order (Mar. 9, 2021). The court, in determining relief under the EHPA, must consider the application or request brought by the “individual or groups of individuals . . . quarantined”—not determine and order relief that subsequently applies to all quarantined individuals irrespective of the evolving circumstances of a public health emergency. See 10 GCA § 19605(c)⁠(1) and (c)⁠(2).</w:t>
       </w:r>
     </w:p>
     <w:p>
@@ -5922,7 +5904,7 @@
         <w:pStyle w:val="BodyText"/>
       </w:pPr>
       <w:r>
-        <w:t xml:space="preserve">The Governor and the PDSC dispute the extent to which, in various instances, the Superior Court may have misapplied the standards in determining whether DPHSS was quarantining individuals in accordance with the conditions included in 10 GCA § 19604(b)⁠(1)-(8), and in so doing, impacted the Governor’s quarantine policy. The Legislature does not take a position as to the appropriate standard that applies in determinations for relief under the EHPA or whether the court misapplied the law. There is a difference between precedent and policy. Such judicial determinations for relief, which the Governor and PDSC debate at length, has no bearing on the organicity of the quarantine provisions of the EHPA. The deficiency may lie in the application of the law—not the law in and of itself.</w:t>
+        <w:t xml:space="preserve">The Governor and the PDSC dispute the extent to which, in various instances, the Superior Court may have misapplied the standards in determining whether DPHSS was quarantining individuals in accordance with the conditions included in 10 GCA § 19604(b)⁠(1)-⁠(8), and in so doing, impacted the Governor’s quarantine policy. The Legislature does not take a position as to the appropriate standard that applies in determinations for relief under the EHPA or whether the court misapplied the law. There is a difference between precedent and policy. Such judicial determinations for relief, which the Governor and PDSC debate at length, has no bearing on the organicity of the quarantine provisions of the EHPA. The deficiency may lie in the application of the law—not the law in and of itself.</w:t>
       </w:r>
     </w:p>
     <w:p>
@@ -6327,7 +6309,7 @@
         <w:pStyle w:val="XdQuoteOnly"/>
       </w:pPr>
       <w:r>
-        <w:t xml:space="preserve">[the Bill] I think protects the individuals who are isolated or quarantine[d] and [] feel that their rights have been violated, because sometimes in emergency situations panic can occur and you maybe . . . come into situations where you may just be isolating and quarantining people maybe unnecessarily[.] [S]o it does have provisions in here that protect the rights of those individuals.</w:t>
+        <w:t xml:space="preserve">[the Bill] I think protects the individuals who are isolated or quarantine[d] and [] feel that their rights have been violated, because sometimes in emergency situations panic can occur and you maybe . . . come into situations where you may just be isolating and quarantining people maybe unnecessarily[.] [S]o it does have provisions in here that protect the rights of those individuals.</w:t>
       </w:r>
     </w:p>
     <w:p>
@@ -6363,7 +6345,7 @@
         <w:t xml:space="preserve"> </w:t>
       </w:r>
       <w:r>
-        <w:t xml:space="preserve">This balance comports with the separation of powers doctrine, which exists to “prevent[ ] the abuses that can flow from centralization of power.”</w:t>
+        <w:t xml:space="preserve">This balance comports with the separation of powers doctrine, which exists to “prevent[ ] the abuses that can flow from centralization of power.”</w:t>
       </w:r>
       <w:r>
         <w:t xml:space="preserve"> </w:t>
@@ -11011,6 +10993,33 @@
       <w:ind w:left="2160" w:hanging="720"/>
     </w:pPr>
   </w:style>
+  <w:style w:type="paragraph" w:customStyle="1" w:styleId="XdQuoteList1">
+    <w:name w:val="Xd Quote List 1"/>
+    <w:basedOn w:val="Normal"/>
+    <w:qFormat/>
+    <w:pPr>
+      <w:spacing w:before="0" w:after="0" w:line="322" w:lineRule="exact"/>
+      <w:ind w:left="1440" w:right="720" w:hanging="720"/>
+    </w:pPr>
+  </w:style>
+  <w:style w:type="paragraph" w:customStyle="1" w:styleId="XdQuoteList2">
+    <w:name w:val="Xd Quote List 2"/>
+    <w:basedOn w:val="Normal"/>
+    <w:qFormat/>
+    <w:pPr>
+      <w:spacing w:before="0" w:after="0" w:line="322" w:lineRule="exact"/>
+      <w:ind w:left="2160" w:right="720" w:hanging="720"/>
+    </w:pPr>
+  </w:style>
+  <w:style w:type="paragraph" w:customStyle="1" w:styleId="XdQuoteList3">
+    <w:name w:val="Xd Quote List 3"/>
+    <w:basedOn w:val="Normal"/>
+    <w:qFormat/>
+    <w:pPr>
+      <w:spacing w:before="0" w:after="0" w:line="322" w:lineRule="exact"/>
+      <w:ind w:left="2880" w:right="720" w:hanging="720"/>
+    </w:pPr>
+  </w:style>
   <w:style w:type="paragraph" w:customStyle="1" w:styleId="XdList1">
     <w:name w:val="XdList1"/>
     <w:basedOn w:val="BodyText"/>

</xml_diff>